<commit_message>
docs: finalize complete Lab04D report
</commit_message>
<xml_diff>
--- a/Lab04_WinFormBasic/4D/BaoCao_Lab04D_WinFormBasic_NguyenHuynhPhuongDong_3124411071.docx
+++ b/Lab04_WinFormBasic/4D/BaoCao_Lab04D_WinFormBasic_NguyenHuynhPhuongDong_3124411071.docx
@@ -94,7 +94,7 @@
           <w:color w:val="1F4E79"/>
           <w:sz w:val="30"/>
         </w:rPr>
-        <w:t>Windows Forms cơ bản 2 - Giai đoạn 1</w:t>
+        <w:t>Windows Forms cơ bản 2</w:t>
       </w:r>
     </w:p>
     <w:tbl>
@@ -238,7 +238,7 @@
     </w:p>
     <w:p>
       <w:r>
-        <w:t>Tài liệu Thực hành 04d gồm sáu ứng dụng Windows Forms. Theo yêu cầu thực hiện một nửa tài liệu, giai đoạn 1 hoàn thành đúng ba ứng dụng đầu: hai bài mẫu và bài giải phương trình. Bài làm tập trung vào xử lý sự kiện, kiểm tra dữ liệu, thay đổi thuộc tính điều khiển và tách lớp nghiệp vụ khỏi Form để dễ kiểm tra.</w:t>
+        <w:t>Tài liệu Thực hành 04d gồm sáu ứng dụng Windows Forms. Bài làm đã hoàn thành đầy đủ hai bài mẫu, hai bài thực hành và hai bài quản lý tổng hợp. Nội dung tập trung vào xử lý sự kiện, kiểm tra dữ liệu, thay đổi thuộc tính điều khiển và tách lớp nghiệp vụ khỏi Form để dễ kiểm tra.</w:t>
       </w:r>
     </w:p>
     <w:tbl>
@@ -638,7 +638,7 @@
               <w:rPr>
                 <w:sz w:val="20"/>
               </w:rPr>
-              <w:t>Chờ giai đoạn 2</w:t>
+              <w:t>Hoàn thành</w:t>
             </w:r>
           </w:p>
         </w:tc>
@@ -715,7 +715,7 @@
               <w:rPr>
                 <w:sz w:val="20"/>
               </w:rPr>
-              <w:t>Chờ giai đoạn 2</w:t>
+              <w:t>Hoàn thành</w:t>
             </w:r>
           </w:p>
         </w:tc>
@@ -789,7 +789,7 @@
               <w:rPr>
                 <w:sz w:val="20"/>
               </w:rPr>
-              <w:t>Chờ giai đoạn 2</w:t>
+              <w:t>Hoàn thành</w:t>
             </w:r>
           </w:p>
         </w:tc>
@@ -914,7 +914,49 @@
                 <w:color w:val="000000"/>
                 <w:sz w:val="15"/>
               </w:rPr>
-              <w:t xml:space="preserve">  KiemTra/Lab04D.SelfTest/     # 19 điều kiện kiểm tra tự động</w:t>
+              <w:t xml:space="preserve">  Bai02_MangSoNguyen/          # thao tác mảng một chiều</w:t>
+            </w:r>
+          </w:p>
+          <w:p>
+            <w:pPr>
+              <w:spacing w:before="0" w:after="0" w:line="240" w:lineRule="auto"/>
+              <w:jc w:val="left"/>
+            </w:pPr>
+            <w:r>
+              <w:rPr>
+                <w:rFonts w:ascii="Consolas" w:hAnsi="Consolas" w:eastAsia="Consolas"/>
+                <w:color w:val="000000"/>
+                <w:sz w:val="15"/>
+              </w:rPr>
+              <w:t xml:space="preserve">  BaiNangCao_CafeSinhVien/     # tính tiền quán cà phê</w:t>
+            </w:r>
+          </w:p>
+          <w:p>
+            <w:pPr>
+              <w:spacing w:before="0" w:after="0" w:line="240" w:lineRule="auto"/>
+              <w:jc w:val="left"/>
+            </w:pPr>
+            <w:r>
+              <w:rPr>
+                <w:rFonts w:ascii="Consolas" w:hAnsi="Consolas" w:eastAsia="Consolas"/>
+                <w:color w:val="000000"/>
+                <w:sz w:val="15"/>
+              </w:rPr>
+              <w:t xml:space="preserve">  BaiVeNha_KhachSanThanhThanh/ # tính tiền phòng khách sạn</w:t>
+            </w:r>
+          </w:p>
+          <w:p>
+            <w:pPr>
+              <w:spacing w:before="0" w:after="0" w:line="240" w:lineRule="auto"/>
+              <w:jc w:val="left"/>
+            </w:pPr>
+            <w:r>
+              <w:rPr>
+                <w:rFonts w:ascii="Consolas" w:hAnsi="Consolas" w:eastAsia="Consolas"/>
+                <w:color w:val="000000"/>
+                <w:sz w:val="15"/>
+              </w:rPr>
+              <w:t xml:space="preserve">  KiemTra/Lab04D.SelfTest/     # 45 điều kiện kiểm tra tự động</w:t>
             </w:r>
           </w:p>
         </w:tc>
@@ -2301,6 +2343,1346 @@
         <w:spacing w:after="160"/>
       </w:pPr>
       <w:r>
+        <w:t>Bài 2 mảng một chiều số nguyên</w:t>
+      </w:r>
+    </w:p>
+    <w:p>
+      <w:pPr>
+        <w:keepNext/>
+        <w:spacing w:after="60"/>
+        <w:jc w:val="center"/>
+      </w:pPr>
+      <w:r>
+        <w:drawing>
+          <wp:inline xmlns:a="http://schemas.openxmlformats.org/drawingml/2006/main" xmlns:pic="http://schemas.openxmlformats.org/drawingml/2006/picture">
+            <wp:extent cx="4464000" cy="3323497"/>
+            <wp:docPr id="5" name="Picture 5"/>
+            <wp:cNvGraphicFramePr>
+              <a:graphicFrameLocks noChangeAspect="1"/>
+            </wp:cNvGraphicFramePr>
+            <a:graphic>
+              <a:graphicData uri="http://schemas.openxmlformats.org/drawingml/2006/picture">
+                <pic:pic>
+                  <pic:nvPicPr>
+                    <pic:cNvPr id="0" name="04-mang-so-nguyen.png"/>
+                    <pic:cNvPicPr/>
+                  </pic:nvPicPr>
+                  <pic:blipFill>
+                    <a:blip r:embed="rId16"/>
+                    <a:stretch>
+                      <a:fillRect/>
+                    </a:stretch>
+                  </pic:blipFill>
+                  <pic:spPr>
+                    <a:xfrm>
+                      <a:off x="0" y="0"/>
+                      <a:ext cx="4464000" cy="3323497"/>
+                    </a:xfrm>
+                    <a:prstGeom prst="rect"/>
+                  </pic:spPr>
+                </pic:pic>
+              </a:graphicData>
+            </a:graphic>
+          </wp:inline>
+        </w:drawing>
+      </w:r>
+    </w:p>
+    <w:p>
+      <w:pPr>
+        <w:spacing w:after="100"/>
+        <w:jc w:val="center"/>
+      </w:pPr>
+      <w:r>
+        <w:rPr>
+          <w:rFonts w:ascii="Times New Roman" w:hAnsi="Times New Roman" w:eastAsia="Times New Roman"/>
+          <w:b w:val="0"/>
+          <w:i/>
+          <w:color w:val="404040"/>
+          <w:sz w:val="20"/>
+        </w:rPr>
+        <w:t>Giao diện đầy đủ các thao tác với mảng số nguyên</w:t>
+      </w:r>
+    </w:p>
+    <w:p>
+      <w:pPr>
+        <w:keepNext/>
+        <w:spacing w:before="120" w:after="80"/>
+      </w:pPr>
+      <w:r>
+        <w:rPr>
+          <w:rFonts w:ascii="Times New Roman" w:hAnsi="Times New Roman" w:eastAsia="Times New Roman"/>
+          <w:b/>
+          <w:color w:val="1F4E79"/>
+          <w:sz w:val="22"/>
+        </w:rPr>
+        <w:t>Yêu cầu và kết quả</w:t>
+      </w:r>
+    </w:p>
+    <w:p>
+      <w:r>
+        <w:t>Ứng dụng nhận mảng số nguyên phân cách bằng khoảng trắng, dấu phẩy hoặc dấu chấm phẩy. Người dùng có thể sắp xếp tăng hoặc giảm, tìm kiếm, thêm, xóa và thay thế theo giá trị hoặc vị trí; đồng thời tính tổng toàn mảng, tổng chẵn, tổng lẻ, giá trị lớn nhất và nhỏ nhất.</w:t>
+      </w:r>
+    </w:p>
+    <w:p>
+      <w:pPr>
+        <w:keepNext/>
+        <w:spacing w:before="120" w:after="80"/>
+      </w:pPr>
+      <w:r>
+        <w:rPr>
+          <w:rFonts w:ascii="Times New Roman" w:hAnsi="Times New Roman" w:eastAsia="Times New Roman"/>
+          <w:b/>
+          <w:color w:val="1F4E79"/>
+          <w:sz w:val="22"/>
+        </w:rPr>
+        <w:t>Mã xử lý cốt lõi</w:t>
+      </w:r>
+    </w:p>
+    <w:tbl>
+      <w:tblPr>
+        <w:tblW w:type="auto" w:w="0"/>
+        <w:jc w:val="center"/>
+        <w:tblLayout w:type="fixed"/>
+        <w:tblLook w:firstColumn="1" w:firstRow="1" w:lastColumn="0" w:lastRow="0" w:noHBand="0" w:noVBand="1" w:val="04A0"/>
+      </w:tblPr>
+      <w:tblGrid>
+        <w:gridCol w:w="9298"/>
+      </w:tblGrid>
+      <w:tr>
+        <w:tc>
+          <w:tcPr>
+            <w:tcW w:type="dxa" w:w="9525"/>
+            <w:vAlign w:val="center"/>
+            <w:shd w:fill="F3F6FA"/>
+            <w:tcMar>
+              <w:top w:w="190" w:type="dxa"/>
+              <w:start w:w="260" w:type="dxa"/>
+              <w:bottom w:w="190" w:type="dxa"/>
+              <w:end w:w="260" w:type="dxa"/>
+            </w:tcMar>
+          </w:tcPr>
+          <w:p>
+            <w:pPr>
+              <w:spacing w:before="0" w:after="0" w:line="240" w:lineRule="auto"/>
+              <w:jc w:val="left"/>
+            </w:pPr>
+            <w:r>
+              <w:rPr>
+                <w:rFonts w:ascii="Consolas" w:hAnsi="Consolas" w:eastAsia="Consolas"/>
+                <w:color w:val="000000"/>
+                <w:sz w:val="13"/>
+              </w:rPr>
+              <w:t>public static bool TryParse(string? text, out MangSoNguyen? array, out string error)</w:t>
+            </w:r>
+          </w:p>
+          <w:p>
+            <w:pPr>
+              <w:spacing w:before="0" w:after="0" w:line="240" w:lineRule="auto"/>
+              <w:jc w:val="left"/>
+            </w:pPr>
+            <w:r>
+              <w:rPr>
+                <w:rFonts w:ascii="Consolas" w:hAnsi="Consolas" w:eastAsia="Consolas"/>
+                <w:color w:val="000000"/>
+                <w:sz w:val="13"/>
+              </w:rPr>
+              <w:t>{</w:t>
+            </w:r>
+          </w:p>
+          <w:p>
+            <w:pPr>
+              <w:spacing w:before="0" w:after="0" w:line="240" w:lineRule="auto"/>
+              <w:jc w:val="left"/>
+            </w:pPr>
+            <w:r>
+              <w:rPr>
+                <w:rFonts w:ascii="Consolas" w:hAnsi="Consolas" w:eastAsia="Consolas"/>
+                <w:color w:val="000000"/>
+                <w:sz w:val="13"/>
+              </w:rPr>
+              <w:t xml:space="preserve">    string[] parts = (text ?? string.Empty).Split(</w:t>
+            </w:r>
+          </w:p>
+          <w:p>
+            <w:pPr>
+              <w:spacing w:before="0" w:after="0" w:line="240" w:lineRule="auto"/>
+              <w:jc w:val="left"/>
+            </w:pPr>
+            <w:r>
+              <w:rPr>
+                <w:rFonts w:ascii="Consolas" w:hAnsi="Consolas" w:eastAsia="Consolas"/>
+                <w:color w:val="000000"/>
+                <w:sz w:val="13"/>
+              </w:rPr>
+              <w:t xml:space="preserve">        new[] { ' ', ',', ';', '\t', '\r', '\n' },</w:t>
+            </w:r>
+          </w:p>
+          <w:p>
+            <w:pPr>
+              <w:spacing w:before="0" w:after="0" w:line="240" w:lineRule="auto"/>
+              <w:jc w:val="left"/>
+            </w:pPr>
+            <w:r>
+              <w:rPr>
+                <w:rFonts w:ascii="Consolas" w:hAnsi="Consolas" w:eastAsia="Consolas"/>
+                <w:color w:val="000000"/>
+                <w:sz w:val="13"/>
+              </w:rPr>
+              <w:t xml:space="preserve">        StringSplitOptions.RemoveEmptyEntries | StringSplitOptions.TrimEntries);</w:t>
+            </w:r>
+          </w:p>
+          <w:p>
+            <w:pPr>
+              <w:spacing w:before="0" w:after="0" w:line="240" w:lineRule="auto"/>
+              <w:jc w:val="left"/>
+            </w:pPr>
+            <w:r>
+              <w:rPr>
+                <w:rFonts w:ascii="Consolas" w:hAnsi="Consolas" w:eastAsia="Consolas"/>
+                <w:color w:val="000000"/>
+                <w:sz w:val="13"/>
+              </w:rPr>
+              <w:t xml:space="preserve"> </w:t>
+            </w:r>
+          </w:p>
+          <w:p>
+            <w:pPr>
+              <w:spacing w:before="0" w:after="0" w:line="240" w:lineRule="auto"/>
+              <w:jc w:val="left"/>
+            </w:pPr>
+            <w:r>
+              <w:rPr>
+                <w:rFonts w:ascii="Consolas" w:hAnsi="Consolas" w:eastAsia="Consolas"/>
+                <w:color w:val="000000"/>
+                <w:sz w:val="13"/>
+              </w:rPr>
+              <w:t xml:space="preserve">    if (parts.Length == 0)</w:t>
+            </w:r>
+          </w:p>
+          <w:p>
+            <w:pPr>
+              <w:spacing w:before="0" w:after="0" w:line="240" w:lineRule="auto"/>
+              <w:jc w:val="left"/>
+            </w:pPr>
+            <w:r>
+              <w:rPr>
+                <w:rFonts w:ascii="Consolas" w:hAnsi="Consolas" w:eastAsia="Consolas"/>
+                <w:color w:val="000000"/>
+                <w:sz w:val="13"/>
+              </w:rPr>
+              <w:t xml:space="preserve">    {</w:t>
+            </w:r>
+          </w:p>
+          <w:p>
+            <w:pPr>
+              <w:spacing w:before="0" w:after="0" w:line="240" w:lineRule="auto"/>
+              <w:jc w:val="left"/>
+            </w:pPr>
+            <w:r>
+              <w:rPr>
+                <w:rFonts w:ascii="Consolas" w:hAnsi="Consolas" w:eastAsia="Consolas"/>
+                <w:color w:val="000000"/>
+                <w:sz w:val="13"/>
+              </w:rPr>
+              <w:t xml:space="preserve">        array = null;</w:t>
+            </w:r>
+          </w:p>
+          <w:p>
+            <w:pPr>
+              <w:spacing w:before="0" w:after="0" w:line="240" w:lineRule="auto"/>
+              <w:jc w:val="left"/>
+            </w:pPr>
+            <w:r>
+              <w:rPr>
+                <w:rFonts w:ascii="Consolas" w:hAnsi="Consolas" w:eastAsia="Consolas"/>
+                <w:color w:val="000000"/>
+                <w:sz w:val="13"/>
+              </w:rPr>
+              <w:t xml:space="preserve">        error = "Vui lòng nhập ít nhất một số nguyên.";</w:t>
+            </w:r>
+          </w:p>
+          <w:p>
+            <w:pPr>
+              <w:spacing w:before="0" w:after="0" w:line="240" w:lineRule="auto"/>
+              <w:jc w:val="left"/>
+            </w:pPr>
+            <w:r>
+              <w:rPr>
+                <w:rFonts w:ascii="Consolas" w:hAnsi="Consolas" w:eastAsia="Consolas"/>
+                <w:color w:val="000000"/>
+                <w:sz w:val="13"/>
+              </w:rPr>
+              <w:t xml:space="preserve">        return false;</w:t>
+            </w:r>
+          </w:p>
+          <w:p>
+            <w:pPr>
+              <w:spacing w:before="0" w:after="0" w:line="240" w:lineRule="auto"/>
+              <w:jc w:val="left"/>
+            </w:pPr>
+            <w:r>
+              <w:rPr>
+                <w:rFonts w:ascii="Consolas" w:hAnsi="Consolas" w:eastAsia="Consolas"/>
+                <w:color w:val="000000"/>
+                <w:sz w:val="13"/>
+              </w:rPr>
+              <w:t xml:space="preserve">    }</w:t>
+            </w:r>
+          </w:p>
+          <w:p>
+            <w:pPr>
+              <w:spacing w:before="0" w:after="0" w:line="240" w:lineRule="auto"/>
+              <w:jc w:val="left"/>
+            </w:pPr>
+            <w:r>
+              <w:rPr>
+                <w:rFonts w:ascii="Consolas" w:hAnsi="Consolas" w:eastAsia="Consolas"/>
+                <w:color w:val="000000"/>
+                <w:sz w:val="13"/>
+              </w:rPr>
+              <w:t xml:space="preserve"> </w:t>
+            </w:r>
+          </w:p>
+          <w:p>
+            <w:pPr>
+              <w:spacing w:before="0" w:after="0" w:line="240" w:lineRule="auto"/>
+              <w:jc w:val="left"/>
+            </w:pPr>
+            <w:r>
+              <w:rPr>
+                <w:rFonts w:ascii="Consolas" w:hAnsi="Consolas" w:eastAsia="Consolas"/>
+                <w:color w:val="000000"/>
+                <w:sz w:val="13"/>
+              </w:rPr>
+              <w:t xml:space="preserve">    var values = new List&lt;int&gt;(parts.Length);</w:t>
+            </w:r>
+          </w:p>
+          <w:p>
+            <w:pPr>
+              <w:spacing w:before="0" w:after="0" w:line="240" w:lineRule="auto"/>
+              <w:jc w:val="left"/>
+            </w:pPr>
+            <w:r>
+              <w:rPr>
+                <w:rFonts w:ascii="Consolas" w:hAnsi="Consolas" w:eastAsia="Consolas"/>
+                <w:color w:val="000000"/>
+                <w:sz w:val="13"/>
+              </w:rPr>
+              <w:t xml:space="preserve">    foreach (string part in parts)</w:t>
+            </w:r>
+          </w:p>
+          <w:p>
+            <w:pPr>
+              <w:spacing w:before="0" w:after="0" w:line="240" w:lineRule="auto"/>
+              <w:jc w:val="left"/>
+            </w:pPr>
+            <w:r>
+              <w:rPr>
+                <w:rFonts w:ascii="Consolas" w:hAnsi="Consolas" w:eastAsia="Consolas"/>
+                <w:color w:val="000000"/>
+                <w:sz w:val="13"/>
+              </w:rPr>
+              <w:t xml:space="preserve">    {</w:t>
+            </w:r>
+          </w:p>
+          <w:p>
+            <w:pPr>
+              <w:spacing w:before="0" w:after="0" w:line="240" w:lineRule="auto"/>
+              <w:jc w:val="left"/>
+            </w:pPr>
+            <w:r>
+              <w:rPr>
+                <w:rFonts w:ascii="Consolas" w:hAnsi="Consolas" w:eastAsia="Consolas"/>
+                <w:color w:val="000000"/>
+                <w:sz w:val="13"/>
+              </w:rPr>
+              <w:t xml:space="preserve">        if (!int.TryParse(part, NumberStyles.Integer, CultureInfo.InvariantCulture, out int value))</w:t>
+            </w:r>
+          </w:p>
+          <w:p>
+            <w:pPr>
+              <w:spacing w:before="0" w:after="0" w:line="240" w:lineRule="auto"/>
+              <w:jc w:val="left"/>
+            </w:pPr>
+            <w:r>
+              <w:rPr>
+                <w:rFonts w:ascii="Consolas" w:hAnsi="Consolas" w:eastAsia="Consolas"/>
+                <w:color w:val="000000"/>
+                <w:sz w:val="13"/>
+              </w:rPr>
+              <w:t xml:space="preserve">        {</w:t>
+            </w:r>
+          </w:p>
+          <w:p>
+            <w:pPr>
+              <w:spacing w:before="0" w:after="0" w:line="240" w:lineRule="auto"/>
+              <w:jc w:val="left"/>
+            </w:pPr>
+            <w:r>
+              <w:rPr>
+                <w:rFonts w:ascii="Consolas" w:hAnsi="Consolas" w:eastAsia="Consolas"/>
+                <w:color w:val="000000"/>
+                <w:sz w:val="13"/>
+              </w:rPr>
+              <w:t xml:space="preserve">            array = null;</w:t>
+            </w:r>
+          </w:p>
+          <w:p>
+            <w:pPr>
+              <w:spacing w:before="0" w:after="0" w:line="240" w:lineRule="auto"/>
+              <w:jc w:val="left"/>
+            </w:pPr>
+            <w:r>
+              <w:rPr>
+                <w:rFonts w:ascii="Consolas" w:hAnsi="Consolas" w:eastAsia="Consolas"/>
+                <w:color w:val="000000"/>
+                <w:sz w:val="13"/>
+              </w:rPr>
+              <w:t xml:space="preserve">            error = $"'{part}' không phải là số nguyên hợp lệ.";</w:t>
+            </w:r>
+          </w:p>
+          <w:p>
+            <w:pPr>
+              <w:spacing w:before="0" w:after="0" w:line="240" w:lineRule="auto"/>
+              <w:jc w:val="left"/>
+            </w:pPr>
+            <w:r>
+              <w:rPr>
+                <w:rFonts w:ascii="Consolas" w:hAnsi="Consolas" w:eastAsia="Consolas"/>
+                <w:color w:val="000000"/>
+                <w:sz w:val="13"/>
+              </w:rPr>
+              <w:t xml:space="preserve">            return false;</w:t>
+            </w:r>
+          </w:p>
+          <w:p>
+            <w:pPr>
+              <w:spacing w:before="0" w:after="0" w:line="240" w:lineRule="auto"/>
+              <w:jc w:val="left"/>
+            </w:pPr>
+            <w:r>
+              <w:rPr>
+                <w:rFonts w:ascii="Consolas" w:hAnsi="Consolas" w:eastAsia="Consolas"/>
+                <w:color w:val="000000"/>
+                <w:sz w:val="13"/>
+              </w:rPr>
+              <w:t>// ... Xem đầy đủ trong file mã nguồn.</w:t>
+            </w:r>
+          </w:p>
+        </w:tc>
+      </w:tr>
+    </w:tbl>
+    <w:p>
+      <w:pPr>
+        <w:keepNext/>
+        <w:spacing w:before="120" w:after="80"/>
+      </w:pPr>
+      <w:r>
+        <w:rPr>
+          <w:rFonts w:ascii="Times New Roman" w:hAnsi="Times New Roman" w:eastAsia="Times New Roman"/>
+          <w:b/>
+          <w:color w:val="1F4E79"/>
+          <w:sz w:val="22"/>
+        </w:rPr>
+        <w:t>Giải thích bài làm</w:t>
+      </w:r>
+    </w:p>
+    <w:p>
+      <w:r>
+        <w:t>MangSoNguyen.TryParse chuẩn hóa ba loại ký tự phân cách, kiểm tra từng phần tử và chỉ khởi tạo đối tượng khi toàn bộ dữ liệu hợp lệ. Các vị trí trên giao diện được quy ước bắt đầu từ 1 rồi chuyển về chỉ số bắt đầu từ 0 khi thao tác với List. Những thao tác có thể vượt phạm vi đều ném ArgumentOutOfRangeException và Form chuyển thông tin này thành cảnh báo dễ hiểu. Sau mỗi lần thay đổi, RefreshArray cập nhật chuỗi kết quả và ShowStatistics tính lại toàn bộ số liệu để giao diện luôn đồng bộ.</w:t>
+      </w:r>
+    </w:p>
+    <w:p>
+      <w:pPr>
+        <w:pStyle w:val="Heading1"/>
+        <w:pageBreakBefore/>
+        <w:spacing w:after="160"/>
+      </w:pPr>
+      <w:r>
+        <w:t>Bài nâng cao Cafe Sinh Viên</w:t>
+      </w:r>
+    </w:p>
+    <w:p>
+      <w:pPr>
+        <w:keepNext/>
+        <w:spacing w:after="60"/>
+        <w:jc w:val="center"/>
+      </w:pPr>
+      <w:r>
+        <w:drawing>
+          <wp:inline xmlns:a="http://schemas.openxmlformats.org/drawingml/2006/main" xmlns:pic="http://schemas.openxmlformats.org/drawingml/2006/picture">
+            <wp:extent cx="4536000" cy="3747130"/>
+            <wp:docPr id="6" name="Picture 6"/>
+            <wp:cNvGraphicFramePr>
+              <a:graphicFrameLocks noChangeAspect="1"/>
+            </wp:cNvGraphicFramePr>
+            <a:graphic>
+              <a:graphicData uri="http://schemas.openxmlformats.org/drawingml/2006/picture">
+                <pic:pic>
+                  <pic:nvPicPr>
+                    <pic:cNvPr id="0" name="05-cafe-sinh-vien.png"/>
+                    <pic:cNvPicPr/>
+                  </pic:nvPicPr>
+                  <pic:blipFill>
+                    <a:blip r:embed="rId17"/>
+                    <a:stretch>
+                      <a:fillRect/>
+                    </a:stretch>
+                  </pic:blipFill>
+                  <pic:spPr>
+                    <a:xfrm>
+                      <a:off x="0" y="0"/>
+                      <a:ext cx="4536000" cy="3747130"/>
+                    </a:xfrm>
+                    <a:prstGeom prst="rect"/>
+                  </pic:spPr>
+                </pic:pic>
+              </a:graphicData>
+            </a:graphic>
+          </wp:inline>
+        </w:drawing>
+      </w:r>
+    </w:p>
+    <w:p>
+      <w:pPr>
+        <w:spacing w:after="100"/>
+        <w:jc w:val="center"/>
+      </w:pPr>
+      <w:r>
+        <w:rPr>
+          <w:rFonts w:ascii="Times New Roman" w:hAnsi="Times New Roman" w:eastAsia="Times New Roman"/>
+          <w:b w:val="0"/>
+          <w:i/>
+          <w:color w:val="404040"/>
+          <w:sz w:val="20"/>
+        </w:rPr>
+        <w:t>Giao diện gọi món, giảm giá sinh viên và thanh toán</w:t>
+      </w:r>
+    </w:p>
+    <w:p>
+      <w:pPr>
+        <w:keepNext/>
+        <w:spacing w:before="120" w:after="80"/>
+      </w:pPr>
+      <w:r>
+        <w:rPr>
+          <w:rFonts w:ascii="Times New Roman" w:hAnsi="Times New Roman" w:eastAsia="Times New Roman"/>
+          <w:b/>
+          <w:color w:val="1F4E79"/>
+          <w:sz w:val="22"/>
+        </w:rPr>
+        <w:t>Yêu cầu và kết quả</w:t>
+      </w:r>
+    </w:p>
+    <w:p>
+      <w:r>
+        <w:t>Form quản lý tên khách, số người, loại nước uống, các món ăn và trạng thái sinh viên. Giá nước từ 20.000 đến 35.000 đồng, giá thức ăn từ 15.000 đến 50.000 đồng; nhóm sinh viên được giảm 20%. Sau khi tính tiền, nút Thanh toán cộng số khách và doanh thu vào phần tổng kết.</w:t>
+      </w:r>
+    </w:p>
+    <w:p>
+      <w:pPr>
+        <w:keepNext/>
+        <w:spacing w:before="120" w:after="80"/>
+      </w:pPr>
+      <w:r>
+        <w:rPr>
+          <w:rFonts w:ascii="Times New Roman" w:hAnsi="Times New Roman" w:eastAsia="Times New Roman"/>
+          <w:b/>
+          <w:color w:val="1F4E79"/>
+          <w:sz w:val="22"/>
+        </w:rPr>
+        <w:t>Mã xử lý cốt lõi</w:t>
+      </w:r>
+    </w:p>
+    <w:tbl>
+      <w:tblPr>
+        <w:tblW w:type="auto" w:w="0"/>
+        <w:jc w:val="center"/>
+        <w:tblLayout w:type="fixed"/>
+        <w:tblLook w:firstColumn="1" w:firstRow="1" w:lastColumn="0" w:lastRow="0" w:noHBand="0" w:noVBand="1" w:val="04A0"/>
+      </w:tblPr>
+      <w:tblGrid>
+        <w:gridCol w:w="9298"/>
+      </w:tblGrid>
+      <w:tr>
+        <w:tc>
+          <w:tcPr>
+            <w:tcW w:type="dxa" w:w="9525"/>
+            <w:vAlign w:val="center"/>
+            <w:shd w:fill="F3F6FA"/>
+            <w:tcMar>
+              <w:top w:w="190" w:type="dxa"/>
+              <w:start w:w="260" w:type="dxa"/>
+              <w:bottom w:w="190" w:type="dxa"/>
+              <w:end w:w="260" w:type="dxa"/>
+            </w:tcMar>
+          </w:tcPr>
+          <w:p>
+            <w:pPr>
+              <w:spacing w:before="0" w:after="0" w:line="240" w:lineRule="auto"/>
+              <w:jc w:val="left"/>
+            </w:pPr>
+            <w:r>
+              <w:rPr>
+                <w:rFonts w:ascii="Consolas" w:hAnsi="Consolas" w:eastAsia="Consolas"/>
+                <w:color w:val="000000"/>
+                <w:sz w:val="14"/>
+              </w:rPr>
+              <w:t>public decimal UnitPrice =&gt; DrinkPrices[Drink] + Foods.Distinct().Sum(food =&gt; FoodPrices[food]);</w:t>
+            </w:r>
+          </w:p>
+          <w:p>
+            <w:pPr>
+              <w:spacing w:before="0" w:after="0" w:line="240" w:lineRule="auto"/>
+              <w:jc w:val="left"/>
+            </w:pPr>
+            <w:r>
+              <w:rPr>
+                <w:rFonts w:ascii="Consolas" w:hAnsi="Consolas" w:eastAsia="Consolas"/>
+                <w:color w:val="000000"/>
+                <w:sz w:val="14"/>
+              </w:rPr>
+              <w:t>public decimal Subtotal =&gt; UnitPrice * GuestCount;</w:t>
+            </w:r>
+          </w:p>
+          <w:p>
+            <w:pPr>
+              <w:spacing w:before="0" w:after="0" w:line="240" w:lineRule="auto"/>
+              <w:jc w:val="left"/>
+            </w:pPr>
+            <w:r>
+              <w:rPr>
+                <w:rFonts w:ascii="Consolas" w:hAnsi="Consolas" w:eastAsia="Consolas"/>
+                <w:color w:val="000000"/>
+                <w:sz w:val="14"/>
+              </w:rPr>
+              <w:t>public decimal Discount =&gt; IsStudent ? Subtotal * 0.20m : 0m;</w:t>
+            </w:r>
+          </w:p>
+          <w:p>
+            <w:pPr>
+              <w:spacing w:before="0" w:after="0" w:line="240" w:lineRule="auto"/>
+              <w:jc w:val="left"/>
+            </w:pPr>
+            <w:r>
+              <w:rPr>
+                <w:rFonts w:ascii="Consolas" w:hAnsi="Consolas" w:eastAsia="Consolas"/>
+                <w:color w:val="000000"/>
+                <w:sz w:val="14"/>
+              </w:rPr>
+              <w:t>public decimal Total =&gt; Subtotal - Discount;</w:t>
+            </w:r>
+          </w:p>
+          <w:p>
+            <w:pPr>
+              <w:spacing w:before="0" w:after="0" w:line="240" w:lineRule="auto"/>
+              <w:jc w:val="left"/>
+            </w:pPr>
+            <w:r>
+              <w:rPr>
+                <w:rFonts w:ascii="Consolas" w:hAnsi="Consolas" w:eastAsia="Consolas"/>
+                <w:color w:val="000000"/>
+                <w:sz w:val="14"/>
+              </w:rPr>
+              <w:t xml:space="preserve"> </w:t>
+            </w:r>
+          </w:p>
+          <w:p>
+            <w:pPr>
+              <w:spacing w:before="0" w:after="0" w:line="240" w:lineRule="auto"/>
+              <w:jc w:val="left"/>
+            </w:pPr>
+            <w:r>
+              <w:rPr>
+                <w:rFonts w:ascii="Consolas" w:hAnsi="Consolas" w:eastAsia="Consolas"/>
+                <w:color w:val="000000"/>
+                <w:sz w:val="14"/>
+              </w:rPr>
+              <w:t>public bool TryValidate(out string error)</w:t>
+            </w:r>
+          </w:p>
+          <w:p>
+            <w:pPr>
+              <w:spacing w:before="0" w:after="0" w:line="240" w:lineRule="auto"/>
+              <w:jc w:val="left"/>
+            </w:pPr>
+            <w:r>
+              <w:rPr>
+                <w:rFonts w:ascii="Consolas" w:hAnsi="Consolas" w:eastAsia="Consolas"/>
+                <w:color w:val="000000"/>
+                <w:sz w:val="14"/>
+              </w:rPr>
+              <w:t>{</w:t>
+            </w:r>
+          </w:p>
+          <w:p>
+            <w:pPr>
+              <w:spacing w:before="0" w:after="0" w:line="240" w:lineRule="auto"/>
+              <w:jc w:val="left"/>
+            </w:pPr>
+            <w:r>
+              <w:rPr>
+                <w:rFonts w:ascii="Consolas" w:hAnsi="Consolas" w:eastAsia="Consolas"/>
+                <w:color w:val="000000"/>
+                <w:sz w:val="14"/>
+              </w:rPr>
+              <w:t xml:space="preserve">    if (string.IsNullOrWhiteSpace(CustomerName))</w:t>
+            </w:r>
+          </w:p>
+          <w:p>
+            <w:pPr>
+              <w:spacing w:before="0" w:after="0" w:line="240" w:lineRule="auto"/>
+              <w:jc w:val="left"/>
+            </w:pPr>
+            <w:r>
+              <w:rPr>
+                <w:rFonts w:ascii="Consolas" w:hAnsi="Consolas" w:eastAsia="Consolas"/>
+                <w:color w:val="000000"/>
+                <w:sz w:val="14"/>
+              </w:rPr>
+              <w:t xml:space="preserve">    {</w:t>
+            </w:r>
+          </w:p>
+          <w:p>
+            <w:pPr>
+              <w:spacing w:before="0" w:after="0" w:line="240" w:lineRule="auto"/>
+              <w:jc w:val="left"/>
+            </w:pPr>
+            <w:r>
+              <w:rPr>
+                <w:rFonts w:ascii="Consolas" w:hAnsi="Consolas" w:eastAsia="Consolas"/>
+                <w:color w:val="000000"/>
+                <w:sz w:val="14"/>
+              </w:rPr>
+              <w:t xml:space="preserve">        error = "Tên khách hàng không được để trống.";</w:t>
+            </w:r>
+          </w:p>
+          <w:p>
+            <w:pPr>
+              <w:spacing w:before="0" w:after="0" w:line="240" w:lineRule="auto"/>
+              <w:jc w:val="left"/>
+            </w:pPr>
+            <w:r>
+              <w:rPr>
+                <w:rFonts w:ascii="Consolas" w:hAnsi="Consolas" w:eastAsia="Consolas"/>
+                <w:color w:val="000000"/>
+                <w:sz w:val="14"/>
+              </w:rPr>
+              <w:t xml:space="preserve">        return false;</w:t>
+            </w:r>
+          </w:p>
+          <w:p>
+            <w:pPr>
+              <w:spacing w:before="0" w:after="0" w:line="240" w:lineRule="auto"/>
+              <w:jc w:val="left"/>
+            </w:pPr>
+            <w:r>
+              <w:rPr>
+                <w:rFonts w:ascii="Consolas" w:hAnsi="Consolas" w:eastAsia="Consolas"/>
+                <w:color w:val="000000"/>
+                <w:sz w:val="14"/>
+              </w:rPr>
+              <w:t xml:space="preserve">    }</w:t>
+            </w:r>
+          </w:p>
+          <w:p>
+            <w:pPr>
+              <w:spacing w:before="0" w:after="0" w:line="240" w:lineRule="auto"/>
+              <w:jc w:val="left"/>
+            </w:pPr>
+            <w:r>
+              <w:rPr>
+                <w:rFonts w:ascii="Consolas" w:hAnsi="Consolas" w:eastAsia="Consolas"/>
+                <w:color w:val="000000"/>
+                <w:sz w:val="14"/>
+              </w:rPr>
+              <w:t xml:space="preserve">    if (GuestCount &lt;= 0)</w:t>
+            </w:r>
+          </w:p>
+          <w:p>
+            <w:pPr>
+              <w:spacing w:before="0" w:after="0" w:line="240" w:lineRule="auto"/>
+              <w:jc w:val="left"/>
+            </w:pPr>
+            <w:r>
+              <w:rPr>
+                <w:rFonts w:ascii="Consolas" w:hAnsi="Consolas" w:eastAsia="Consolas"/>
+                <w:color w:val="000000"/>
+                <w:sz w:val="14"/>
+              </w:rPr>
+              <w:t xml:space="preserve">    {</w:t>
+            </w:r>
+          </w:p>
+          <w:p>
+            <w:pPr>
+              <w:spacing w:before="0" w:after="0" w:line="240" w:lineRule="auto"/>
+              <w:jc w:val="left"/>
+            </w:pPr>
+            <w:r>
+              <w:rPr>
+                <w:rFonts w:ascii="Consolas" w:hAnsi="Consolas" w:eastAsia="Consolas"/>
+                <w:color w:val="000000"/>
+                <w:sz w:val="14"/>
+              </w:rPr>
+              <w:t xml:space="preserve">        error = "Số khách hàng phải là số nguyên dương.";</w:t>
+            </w:r>
+          </w:p>
+          <w:p>
+            <w:pPr>
+              <w:spacing w:before="0" w:after="0" w:line="240" w:lineRule="auto"/>
+              <w:jc w:val="left"/>
+            </w:pPr>
+            <w:r>
+              <w:rPr>
+                <w:rFonts w:ascii="Consolas" w:hAnsi="Consolas" w:eastAsia="Consolas"/>
+                <w:color w:val="000000"/>
+                <w:sz w:val="14"/>
+              </w:rPr>
+              <w:t xml:space="preserve">        return false;</w:t>
+            </w:r>
+          </w:p>
+          <w:p>
+            <w:pPr>
+              <w:spacing w:before="0" w:after="0" w:line="240" w:lineRule="auto"/>
+              <w:jc w:val="left"/>
+            </w:pPr>
+            <w:r>
+              <w:rPr>
+                <w:rFonts w:ascii="Consolas" w:hAnsi="Consolas" w:eastAsia="Consolas"/>
+                <w:color w:val="000000"/>
+                <w:sz w:val="14"/>
+              </w:rPr>
+              <w:t xml:space="preserve">    }</w:t>
+            </w:r>
+          </w:p>
+          <w:p>
+            <w:pPr>
+              <w:spacing w:before="0" w:after="0" w:line="240" w:lineRule="auto"/>
+              <w:jc w:val="left"/>
+            </w:pPr>
+            <w:r>
+              <w:rPr>
+                <w:rFonts w:ascii="Consolas" w:hAnsi="Consolas" w:eastAsia="Consolas"/>
+                <w:color w:val="000000"/>
+                <w:sz w:val="14"/>
+              </w:rPr>
+              <w:t xml:space="preserve">    if (Foods.Count == 0)</w:t>
+            </w:r>
+          </w:p>
+          <w:p>
+            <w:pPr>
+              <w:spacing w:before="0" w:after="0" w:line="240" w:lineRule="auto"/>
+              <w:jc w:val="left"/>
+            </w:pPr>
+            <w:r>
+              <w:rPr>
+                <w:rFonts w:ascii="Consolas" w:hAnsi="Consolas" w:eastAsia="Consolas"/>
+                <w:color w:val="000000"/>
+                <w:sz w:val="14"/>
+              </w:rPr>
+              <w:t>// ... Xem đầy đủ trong file mã nguồn.</w:t>
+            </w:r>
+          </w:p>
+        </w:tc>
+      </w:tr>
+    </w:tbl>
+    <w:p>
+      <w:pPr>
+        <w:keepNext/>
+        <w:spacing w:before="120" w:after="80"/>
+      </w:pPr>
+      <w:r>
+        <w:rPr>
+          <w:rFonts w:ascii="Times New Roman" w:hAnsi="Times New Roman" w:eastAsia="Times New Roman"/>
+          <w:b/>
+          <w:color w:val="1F4E79"/>
+          <w:sz w:val="22"/>
+        </w:rPr>
+        <w:t>Giải thích bài làm</w:t>
+      </w:r>
+    </w:p>
+    <w:p>
+      <w:r>
+        <w:t>Bảng giá được lưu bằng Dictionary theo enum CafeDrink và CafeFood nên không phụ thuộc vào chuỗi hiển thị trên Form. UnitPrice cộng một thức uống với các món ăn không trùng; Subtotal nhân đơn giá với số khách và Discount áp dụng tỷ lệ 20% khi chọn Sinh viên. Nút Tính tiền chỉ được bật khi tên, số khách, thức uống và ít nhất một món ăn hợp lệ. Kết quả được giữ trong _pendingOrder cho tới khi người dùng thanh toán, nhờ đó tránh cộng doanh thu hai lần. Sau thanh toán, Form trở về trạng thái sẵn sàng đón nhóm khách mới.</w:t>
+      </w:r>
+    </w:p>
+    <w:p>
+      <w:pPr>
+        <w:pStyle w:val="Heading1"/>
+        <w:pageBreakBefore/>
+        <w:spacing w:after="160"/>
+      </w:pPr>
+      <w:r>
+        <w:t>Bài về nhà Khách sạn Thanh Thanh</w:t>
+      </w:r>
+    </w:p>
+    <w:p>
+      <w:pPr>
+        <w:keepNext/>
+        <w:spacing w:after="60"/>
+        <w:jc w:val="center"/>
+      </w:pPr>
+      <w:r>
+        <w:drawing>
+          <wp:inline xmlns:a="http://schemas.openxmlformats.org/drawingml/2006/main" xmlns:pic="http://schemas.openxmlformats.org/drawingml/2006/picture">
+            <wp:extent cx="4824000" cy="3222976"/>
+            <wp:docPr id="7" name="Picture 7"/>
+            <wp:cNvGraphicFramePr>
+              <a:graphicFrameLocks noChangeAspect="1"/>
+            </wp:cNvGraphicFramePr>
+            <a:graphic>
+              <a:graphicData uri="http://schemas.openxmlformats.org/drawingml/2006/picture">
+                <pic:pic>
+                  <pic:nvPicPr>
+                    <pic:cNvPr id="0" name="06-khach-san-thanh-thanh.png"/>
+                    <pic:cNvPicPr/>
+                  </pic:nvPicPr>
+                  <pic:blipFill>
+                    <a:blip r:embed="rId18"/>
+                    <a:stretch>
+                      <a:fillRect/>
+                    </a:stretch>
+                  </pic:blipFill>
+                  <pic:spPr>
+                    <a:xfrm>
+                      <a:off x="0" y="0"/>
+                      <a:ext cx="4824000" cy="3222976"/>
+                    </a:xfrm>
+                    <a:prstGeom prst="rect"/>
+                  </pic:spPr>
+                </pic:pic>
+              </a:graphicData>
+            </a:graphic>
+          </wp:inline>
+        </w:drawing>
+      </w:r>
+    </w:p>
+    <w:p>
+      <w:pPr>
+        <w:spacing w:after="100"/>
+        <w:jc w:val="center"/>
+      </w:pPr>
+      <w:r>
+        <w:rPr>
+          <w:rFonts w:ascii="Times New Roman" w:hAnsi="Times New Roman" w:eastAsia="Times New Roman"/>
+          <w:b w:val="0"/>
+          <w:i/>
+          <w:color w:val="404040"/>
+          <w:sz w:val="20"/>
+        </w:rPr>
+        <w:t>Giao diện tính tiền phòng và tổng kết doanh thu khách sạn</w:t>
+      </w:r>
+    </w:p>
+    <w:p>
+      <w:pPr>
+        <w:keepNext/>
+        <w:spacing w:before="120" w:after="80"/>
+      </w:pPr>
+      <w:r>
+        <w:rPr>
+          <w:rFonts w:ascii="Times New Roman" w:hAnsi="Times New Roman" w:eastAsia="Times New Roman"/>
+          <w:b/>
+          <w:color w:val="1F4E79"/>
+          <w:sz w:val="22"/>
+        </w:rPr>
+        <w:t>Yêu cầu và kết quả</w:t>
+      </w:r>
+    </w:p>
+    <w:p>
+      <w:r>
+        <w:t>Ứng dụng nhận họ tên, địa chỉ và số ngày ở; cho chọn phòng đơn 300.000 đồng/ngày, phòng đôi 350.000 đồng/ngày hoặc phòng ba 400.000 đồng/ngày. Mỗi tiện nghi cộng 10.000 đồng, Karaoke cộng 50.000 đồng và ăn sáng cộng 15.000 đồng cho mỗi ngày.</w:t>
+      </w:r>
+    </w:p>
+    <w:p>
+      <w:pPr>
+        <w:keepNext/>
+        <w:spacing w:before="120" w:after="80"/>
+      </w:pPr>
+      <w:r>
+        <w:rPr>
+          <w:rFonts w:ascii="Times New Roman" w:hAnsi="Times New Roman" w:eastAsia="Times New Roman"/>
+          <w:b/>
+          <w:color w:val="1F4E79"/>
+          <w:sz w:val="22"/>
+        </w:rPr>
+        <w:t>Mã xử lý cốt lõi</w:t>
+      </w:r>
+    </w:p>
+    <w:tbl>
+      <w:tblPr>
+        <w:tblW w:type="auto" w:w="0"/>
+        <w:jc w:val="center"/>
+        <w:tblLayout w:type="fixed"/>
+        <w:tblLook w:firstColumn="1" w:firstRow="1" w:lastColumn="0" w:lastRow="0" w:noHBand="0" w:noVBand="1" w:val="04A0"/>
+      </w:tblPr>
+      <w:tblGrid>
+        <w:gridCol w:w="9298"/>
+      </w:tblGrid>
+      <w:tr>
+        <w:tc>
+          <w:tcPr>
+            <w:tcW w:type="dxa" w:w="9525"/>
+            <w:vAlign w:val="center"/>
+            <w:shd w:fill="F3F6FA"/>
+            <w:tcMar>
+              <w:top w:w="190" w:type="dxa"/>
+              <w:start w:w="260" w:type="dxa"/>
+              <w:bottom w:w="190" w:type="dxa"/>
+              <w:end w:w="260" w:type="dxa"/>
+            </w:tcMar>
+          </w:tcPr>
+          <w:p>
+            <w:pPr>
+              <w:spacing w:before="0" w:after="0" w:line="240" w:lineRule="auto"/>
+              <w:jc w:val="left"/>
+            </w:pPr>
+            <w:r>
+              <w:rPr>
+                <w:rFonts w:ascii="Consolas" w:hAnsi="Consolas" w:eastAsia="Consolas"/>
+                <w:color w:val="000000"/>
+                <w:sz w:val="14"/>
+              </w:rPr>
+              <w:t>public decimal RoomRate =&gt; RoomType switch</w:t>
+            </w:r>
+          </w:p>
+          <w:p>
+            <w:pPr>
+              <w:spacing w:before="0" w:after="0" w:line="240" w:lineRule="auto"/>
+              <w:jc w:val="left"/>
+            </w:pPr>
+            <w:r>
+              <w:rPr>
+                <w:rFonts w:ascii="Consolas" w:hAnsi="Consolas" w:eastAsia="Consolas"/>
+                <w:color w:val="000000"/>
+                <w:sz w:val="14"/>
+              </w:rPr>
+              <w:t>{</w:t>
+            </w:r>
+          </w:p>
+          <w:p>
+            <w:pPr>
+              <w:spacing w:before="0" w:after="0" w:line="240" w:lineRule="auto"/>
+              <w:jc w:val="left"/>
+            </w:pPr>
+            <w:r>
+              <w:rPr>
+                <w:rFonts w:ascii="Consolas" w:hAnsi="Consolas" w:eastAsia="Consolas"/>
+                <w:color w:val="000000"/>
+                <w:sz w:val="14"/>
+              </w:rPr>
+              <w:t xml:space="preserve">    HotelRoomType.Single =&gt; 300_000,</w:t>
+            </w:r>
+          </w:p>
+          <w:p>
+            <w:pPr>
+              <w:spacing w:before="0" w:after="0" w:line="240" w:lineRule="auto"/>
+              <w:jc w:val="left"/>
+            </w:pPr>
+            <w:r>
+              <w:rPr>
+                <w:rFonts w:ascii="Consolas" w:hAnsi="Consolas" w:eastAsia="Consolas"/>
+                <w:color w:val="000000"/>
+                <w:sz w:val="14"/>
+              </w:rPr>
+              <w:t xml:space="preserve">    HotelRoomType.Double =&gt; 350_000,</w:t>
+            </w:r>
+          </w:p>
+          <w:p>
+            <w:pPr>
+              <w:spacing w:before="0" w:after="0" w:line="240" w:lineRule="auto"/>
+              <w:jc w:val="left"/>
+            </w:pPr>
+            <w:r>
+              <w:rPr>
+                <w:rFonts w:ascii="Consolas" w:hAnsi="Consolas" w:eastAsia="Consolas"/>
+                <w:color w:val="000000"/>
+                <w:sz w:val="14"/>
+              </w:rPr>
+              <w:t xml:space="preserve">    HotelRoomType.Triple =&gt; 400_000,</w:t>
+            </w:r>
+          </w:p>
+          <w:p>
+            <w:pPr>
+              <w:spacing w:before="0" w:after="0" w:line="240" w:lineRule="auto"/>
+              <w:jc w:val="left"/>
+            </w:pPr>
+            <w:r>
+              <w:rPr>
+                <w:rFonts w:ascii="Consolas" w:hAnsi="Consolas" w:eastAsia="Consolas"/>
+                <w:color w:val="000000"/>
+                <w:sz w:val="14"/>
+              </w:rPr>
+              <w:t xml:space="preserve">    _ =&gt; throw new ArgumentOutOfRangeException(nameof(RoomType))</w:t>
+            </w:r>
+          </w:p>
+          <w:p>
+            <w:pPr>
+              <w:spacing w:before="0" w:after="0" w:line="240" w:lineRule="auto"/>
+              <w:jc w:val="left"/>
+            </w:pPr>
+            <w:r>
+              <w:rPr>
+                <w:rFonts w:ascii="Consolas" w:hAnsi="Consolas" w:eastAsia="Consolas"/>
+                <w:color w:val="000000"/>
+                <w:sz w:val="14"/>
+              </w:rPr>
+              <w:t>};</w:t>
+            </w:r>
+          </w:p>
+          <w:p>
+            <w:pPr>
+              <w:spacing w:before="0" w:after="0" w:line="240" w:lineRule="auto"/>
+              <w:jc w:val="left"/>
+            </w:pPr>
+            <w:r>
+              <w:rPr>
+                <w:rFonts w:ascii="Consolas" w:hAnsi="Consolas" w:eastAsia="Consolas"/>
+                <w:color w:val="000000"/>
+                <w:sz w:val="14"/>
+              </w:rPr>
+              <w:t xml:space="preserve"> </w:t>
+            </w:r>
+          </w:p>
+          <w:p>
+            <w:pPr>
+              <w:spacing w:before="0" w:after="0" w:line="240" w:lineRule="auto"/>
+              <w:jc w:val="left"/>
+            </w:pPr>
+            <w:r>
+              <w:rPr>
+                <w:rFonts w:ascii="Consolas" w:hAnsi="Consolas" w:eastAsia="Consolas"/>
+                <w:color w:val="000000"/>
+                <w:sz w:val="14"/>
+              </w:rPr>
+              <w:t>public int AmenityCount =&gt; (Television ? 1 : 0) + (Internet ? 1 : 0) + (HotWater ? 1 : 0);</w:t>
+            </w:r>
+          </w:p>
+          <w:p>
+            <w:pPr>
+              <w:spacing w:before="0" w:after="0" w:line="240" w:lineRule="auto"/>
+              <w:jc w:val="left"/>
+            </w:pPr>
+            <w:r>
+              <w:rPr>
+                <w:rFonts w:ascii="Consolas" w:hAnsi="Consolas" w:eastAsia="Consolas"/>
+                <w:color w:val="000000"/>
+                <w:sz w:val="14"/>
+              </w:rPr>
+              <w:t>public decimal RoomCharge =&gt; RoomRate * Days;</w:t>
+            </w:r>
+          </w:p>
+          <w:p>
+            <w:pPr>
+              <w:spacing w:before="0" w:after="0" w:line="240" w:lineRule="auto"/>
+              <w:jc w:val="left"/>
+            </w:pPr>
+            <w:r>
+              <w:rPr>
+                <w:rFonts w:ascii="Consolas" w:hAnsi="Consolas" w:eastAsia="Consolas"/>
+                <w:color w:val="000000"/>
+                <w:sz w:val="14"/>
+              </w:rPr>
+              <w:t>public decimal AmenityCharge =&gt; AmenityCount * 10_000m;</w:t>
+            </w:r>
+          </w:p>
+          <w:p>
+            <w:pPr>
+              <w:spacing w:before="0" w:after="0" w:line="240" w:lineRule="auto"/>
+              <w:jc w:val="left"/>
+            </w:pPr>
+            <w:r>
+              <w:rPr>
+                <w:rFonts w:ascii="Consolas" w:hAnsi="Consolas" w:eastAsia="Consolas"/>
+                <w:color w:val="000000"/>
+                <w:sz w:val="14"/>
+              </w:rPr>
+              <w:t>public decimal ServiceCharge =&gt; (Karaoke ? 50_000m : 0m) + (Breakfast ? 15_000m * Days : 0m);</w:t>
+            </w:r>
+          </w:p>
+          <w:p>
+            <w:pPr>
+              <w:spacing w:before="0" w:after="0" w:line="240" w:lineRule="auto"/>
+              <w:jc w:val="left"/>
+            </w:pPr>
+            <w:r>
+              <w:rPr>
+                <w:rFonts w:ascii="Consolas" w:hAnsi="Consolas" w:eastAsia="Consolas"/>
+                <w:color w:val="000000"/>
+                <w:sz w:val="14"/>
+              </w:rPr>
+              <w:t>public decimal Total =&gt; RoomCharge + AmenityCharge + ServiceCharge;</w:t>
+            </w:r>
+          </w:p>
+          <w:p>
+            <w:pPr>
+              <w:spacing w:before="0" w:after="0" w:line="240" w:lineRule="auto"/>
+              <w:jc w:val="left"/>
+            </w:pPr>
+            <w:r>
+              <w:rPr>
+                <w:rFonts w:ascii="Consolas" w:hAnsi="Consolas" w:eastAsia="Consolas"/>
+                <w:color w:val="000000"/>
+                <w:sz w:val="14"/>
+              </w:rPr>
+              <w:t xml:space="preserve"> </w:t>
+            </w:r>
+          </w:p>
+          <w:p>
+            <w:pPr>
+              <w:spacing w:before="0" w:after="0" w:line="240" w:lineRule="auto"/>
+              <w:jc w:val="left"/>
+            </w:pPr>
+            <w:r>
+              <w:rPr>
+                <w:rFonts w:ascii="Consolas" w:hAnsi="Consolas" w:eastAsia="Consolas"/>
+                <w:color w:val="000000"/>
+                <w:sz w:val="14"/>
+              </w:rPr>
+              <w:t>public bool TryValidate(out string error)</w:t>
+            </w:r>
+          </w:p>
+          <w:p>
+            <w:pPr>
+              <w:spacing w:before="0" w:after="0" w:line="240" w:lineRule="auto"/>
+              <w:jc w:val="left"/>
+            </w:pPr>
+            <w:r>
+              <w:rPr>
+                <w:rFonts w:ascii="Consolas" w:hAnsi="Consolas" w:eastAsia="Consolas"/>
+                <w:color w:val="000000"/>
+                <w:sz w:val="14"/>
+              </w:rPr>
+              <w:t>{</w:t>
+            </w:r>
+          </w:p>
+          <w:p>
+            <w:pPr>
+              <w:spacing w:before="0" w:after="0" w:line="240" w:lineRule="auto"/>
+              <w:jc w:val="left"/>
+            </w:pPr>
+            <w:r>
+              <w:rPr>
+                <w:rFonts w:ascii="Consolas" w:hAnsi="Consolas" w:eastAsia="Consolas"/>
+                <w:color w:val="000000"/>
+                <w:sz w:val="14"/>
+              </w:rPr>
+              <w:t xml:space="preserve">    if (string.IsNullOrWhiteSpace(CustomerName))</w:t>
+            </w:r>
+          </w:p>
+          <w:p>
+            <w:pPr>
+              <w:spacing w:before="0" w:after="0" w:line="240" w:lineRule="auto"/>
+              <w:jc w:val="left"/>
+            </w:pPr>
+            <w:r>
+              <w:rPr>
+                <w:rFonts w:ascii="Consolas" w:hAnsi="Consolas" w:eastAsia="Consolas"/>
+                <w:color w:val="000000"/>
+                <w:sz w:val="14"/>
+              </w:rPr>
+              <w:t xml:space="preserve">    {</w:t>
+            </w:r>
+          </w:p>
+          <w:p>
+            <w:pPr>
+              <w:spacing w:before="0" w:after="0" w:line="240" w:lineRule="auto"/>
+              <w:jc w:val="left"/>
+            </w:pPr>
+            <w:r>
+              <w:rPr>
+                <w:rFonts w:ascii="Consolas" w:hAnsi="Consolas" w:eastAsia="Consolas"/>
+                <w:color w:val="000000"/>
+                <w:sz w:val="14"/>
+              </w:rPr>
+              <w:t xml:space="preserve">        error = "Họ và tên khách hàng không được để trống.";</w:t>
+            </w:r>
+          </w:p>
+          <w:p>
+            <w:pPr>
+              <w:spacing w:before="0" w:after="0" w:line="240" w:lineRule="auto"/>
+              <w:jc w:val="left"/>
+            </w:pPr>
+            <w:r>
+              <w:rPr>
+                <w:rFonts w:ascii="Consolas" w:hAnsi="Consolas" w:eastAsia="Consolas"/>
+                <w:color w:val="000000"/>
+                <w:sz w:val="14"/>
+              </w:rPr>
+              <w:t xml:space="preserve">        return false;</w:t>
+            </w:r>
+          </w:p>
+          <w:p>
+            <w:pPr>
+              <w:spacing w:before="0" w:after="0" w:line="240" w:lineRule="auto"/>
+              <w:jc w:val="left"/>
+            </w:pPr>
+            <w:r>
+              <w:rPr>
+                <w:rFonts w:ascii="Consolas" w:hAnsi="Consolas" w:eastAsia="Consolas"/>
+                <w:color w:val="000000"/>
+                <w:sz w:val="14"/>
+              </w:rPr>
+              <w:t xml:space="preserve">    }</w:t>
+            </w:r>
+          </w:p>
+          <w:p>
+            <w:pPr>
+              <w:spacing w:before="0" w:after="0" w:line="240" w:lineRule="auto"/>
+              <w:jc w:val="left"/>
+            </w:pPr>
+            <w:r>
+              <w:rPr>
+                <w:rFonts w:ascii="Consolas" w:hAnsi="Consolas" w:eastAsia="Consolas"/>
+                <w:color w:val="000000"/>
+                <w:sz w:val="14"/>
+              </w:rPr>
+              <w:t xml:space="preserve">    if (string.IsNullOrWhiteSpace(Address))</w:t>
+            </w:r>
+          </w:p>
+          <w:p>
+            <w:pPr>
+              <w:spacing w:before="0" w:after="0" w:line="240" w:lineRule="auto"/>
+              <w:jc w:val="left"/>
+            </w:pPr>
+            <w:r>
+              <w:rPr>
+                <w:rFonts w:ascii="Consolas" w:hAnsi="Consolas" w:eastAsia="Consolas"/>
+                <w:color w:val="000000"/>
+                <w:sz w:val="14"/>
+              </w:rPr>
+              <w:t>// ... Xem đầy đủ trong file mã nguồn.</w:t>
+            </w:r>
+          </w:p>
+        </w:tc>
+      </w:tr>
+    </w:tbl>
+    <w:p>
+      <w:pPr>
+        <w:keepNext/>
+        <w:spacing w:before="120" w:after="80"/>
+      </w:pPr>
+      <w:r>
+        <w:rPr>
+          <w:rFonts w:ascii="Times New Roman" w:hAnsi="Times New Roman" w:eastAsia="Times New Roman"/>
+          <w:b/>
+          <w:color w:val="1F4E79"/>
+          <w:sz w:val="22"/>
+        </w:rPr>
+        <w:t>Giải thích bài làm</w:t>
+      </w:r>
+    </w:p>
+    <w:p>
+      <w:r>
+        <w:t>HotelBill tách tiền phòng, tiền tiện nghi và tiền dịch vụ thành ba thuộc tính trước khi cộng thành Total. Cách tách giúp dễ đối chiếu công thức và kiểm tra từng phần. Nút Thanh toán chỉ hoạt động khi họ tên, địa chỉ và số ngày đều hợp lệ; mỗi hóa đơn đã thanh toán được cộng đúng một lần vào số lượt khách và doanh thu trong ngày. Nhập mới xóa dữ liệu của khách hiện tại nhưng giữ số liệu tích lũy. Tổng kết hiển thị số liệu, sau đó đặt bộ đếm về 0 để bắt đầu một kỳ thống kê mới.</w:t>
+      </w:r>
+    </w:p>
+    <w:p>
+      <w:pPr>
+        <w:pStyle w:val="Heading1"/>
+        <w:pageBreakBefore/>
+        <w:spacing w:after="160"/>
+      </w:pPr>
+      <w:r>
         <w:t>Kết quả kiểm tra và kết luận</w:t>
       </w:r>
     </w:p>
@@ -2367,7 +3749,7 @@
                 <w:color w:val="000000"/>
                 <w:sz w:val="18"/>
               </w:rPr>
-              <w:t>KIỂM TRA THÀNH CÔNG: 19/19 điều kiện đạt.</w:t>
+              <w:t>KIỂM TRA THÀNH CÔNG: 45/45 điều kiện đạt.</w:t>
             </w:r>
           </w:p>
         </w:tc>
@@ -2706,6 +4088,161 @@
           </w:p>
         </w:tc>
       </w:tr>
+      <w:tr>
+        <w:trPr>
+          <w:cantSplit/>
+        </w:trPr>
+        <w:tc>
+          <w:tcPr>
+            <w:tcW w:type="dxa" w:w="2438"/>
+            <w:vAlign w:val="center"/>
+            <w:tcMar>
+              <w:top w:w="170" w:type="dxa"/>
+              <w:start w:w="210" w:type="dxa"/>
+              <w:bottom w:w="170" w:type="dxa"/>
+              <w:end w:w="210" w:type="dxa"/>
+            </w:tcMar>
+          </w:tcPr>
+          <w:p>
+            <w:pPr>
+              <w:spacing w:after="0"/>
+            </w:pPr>
+            <w:r>
+              <w:rPr>
+                <w:sz w:val="20"/>
+              </w:rPr>
+              <w:t>Mảng số nguyên</w:t>
+            </w:r>
+          </w:p>
+        </w:tc>
+        <w:tc>
+          <w:tcPr>
+            <w:tcW w:type="dxa" w:w="6860"/>
+            <w:vAlign w:val="center"/>
+            <w:tcMar>
+              <w:top w:w="170" w:type="dxa"/>
+              <w:start w:w="210" w:type="dxa"/>
+              <w:bottom w:w="170" w:type="dxa"/>
+              <w:end w:w="210" w:type="dxa"/>
+            </w:tcMar>
+          </w:tcPr>
+          <w:p>
+            <w:pPr>
+              <w:spacing w:after="0"/>
+            </w:pPr>
+            <w:r>
+              <w:rPr>
+                <w:sz w:val="20"/>
+              </w:rPr>
+              <w:t>Đúng các thao tác sắp xếp, tìm, thêm, xóa, thay thế và thống kê</w:t>
+            </w:r>
+          </w:p>
+        </w:tc>
+      </w:tr>
+      <w:tr>
+        <w:trPr>
+          <w:cantSplit/>
+        </w:trPr>
+        <w:tc>
+          <w:tcPr>
+            <w:tcW w:type="dxa" w:w="2438"/>
+            <w:vAlign w:val="center"/>
+            <w:shd w:fill="EAF2F8"/>
+            <w:tcMar>
+              <w:top w:w="170" w:type="dxa"/>
+              <w:start w:w="210" w:type="dxa"/>
+              <w:bottom w:w="170" w:type="dxa"/>
+              <w:end w:w="210" w:type="dxa"/>
+            </w:tcMar>
+          </w:tcPr>
+          <w:p>
+            <w:pPr>
+              <w:spacing w:after="0"/>
+            </w:pPr>
+            <w:r>
+              <w:rPr>
+                <w:sz w:val="20"/>
+              </w:rPr>
+              <w:t>Cafe Sinh Viên</w:t>
+            </w:r>
+          </w:p>
+        </w:tc>
+        <w:tc>
+          <w:tcPr>
+            <w:tcW w:type="dxa" w:w="6860"/>
+            <w:vAlign w:val="center"/>
+            <w:shd w:fill="EAF2F8"/>
+            <w:tcMar>
+              <w:top w:w="170" w:type="dxa"/>
+              <w:start w:w="210" w:type="dxa"/>
+              <w:bottom w:w="170" w:type="dxa"/>
+              <w:end w:w="210" w:type="dxa"/>
+            </w:tcMar>
+          </w:tcPr>
+          <w:p>
+            <w:pPr>
+              <w:spacing w:after="0"/>
+            </w:pPr>
+            <w:r>
+              <w:rPr>
+                <w:sz w:val="20"/>
+              </w:rPr>
+              <w:t>Đúng bảng giá, số khách, giảm 20% và cộng doanh thu</w:t>
+            </w:r>
+          </w:p>
+        </w:tc>
+      </w:tr>
+      <w:tr>
+        <w:trPr>
+          <w:cantSplit/>
+        </w:trPr>
+        <w:tc>
+          <w:tcPr>
+            <w:tcW w:type="dxa" w:w="2438"/>
+            <w:vAlign w:val="center"/>
+            <w:tcMar>
+              <w:top w:w="170" w:type="dxa"/>
+              <w:start w:w="210" w:type="dxa"/>
+              <w:bottom w:w="170" w:type="dxa"/>
+              <w:end w:w="210" w:type="dxa"/>
+            </w:tcMar>
+          </w:tcPr>
+          <w:p>
+            <w:pPr>
+              <w:spacing w:after="0"/>
+            </w:pPr>
+            <w:r>
+              <w:rPr>
+                <w:sz w:val="20"/>
+              </w:rPr>
+              <w:t>Khách sạn</w:t>
+            </w:r>
+          </w:p>
+        </w:tc>
+        <w:tc>
+          <w:tcPr>
+            <w:tcW w:type="dxa" w:w="6860"/>
+            <w:vAlign w:val="center"/>
+            <w:tcMar>
+              <w:top w:w="170" w:type="dxa"/>
+              <w:start w:w="210" w:type="dxa"/>
+              <w:bottom w:w="170" w:type="dxa"/>
+              <w:end w:w="210" w:type="dxa"/>
+            </w:tcMar>
+          </w:tcPr>
+          <w:p>
+            <w:pPr>
+              <w:spacing w:after="0"/>
+            </w:pPr>
+            <w:r>
+              <w:rPr>
+                <w:sz w:val="20"/>
+              </w:rPr>
+              <w:t>Đúng tiền phòng, tiện nghi, dịch vụ và tổng kết trong ngày</w:t>
+            </w:r>
+          </w:p>
+        </w:tc>
+      </w:tr>
     </w:tbl>
     <w:p>
       <w:pPr>
@@ -2724,7 +4261,7 @@
     </w:p>
     <w:p>
       <w:r>
-        <w:t>Giai đoạn 1 của Lab04D đã hoàn thành đúng ba trên sáu ứng dụng trong tài liệu. Các Form có bố cục rõ ràng, hỗ trợ phím Enter hoặc Esc phù hợp, kiểm tra dữ liệu trước khi xử lý và xác nhận khi thoát. Phần nghiệp vụ được tách thành Lab04D.Core, nhờ đó 19 điều kiện tính toán và ràng buộc đã được kiểm tra tự động. Ba phần mảng một chiều, quản lý quán cà phê và quản lý tiền phòng khách sạn được giữ lại cho giai đoạn 2.</w:t>
+        <w:t>Lab04D đã hoàn thành đầy đủ sáu ứng dụng trong tài liệu. Các Form có bố cục rõ ràng, hỗ trợ phím Enter hoặc Esc phù hợp, kiểm tra dữ liệu trước khi xử lý và xác nhận khi thoát. Phần nghiệp vụ được tách thành Lab04D.Core, nhờ đó 45 điều kiện tính toán và ràng buộc đã được kiểm tra tự động. Kết quả build Release không có lỗi hoặc cảnh báo và toàn bộ chức năng chính đều có ảnh minh họa trong báo cáo.</w:t>
       </w:r>
     </w:p>
     <w:sectPr>

</xml_diff>